<commit_message>
docs: update manufacturing DX application package
</commit_message>
<xml_diff>
--- a/public/resume/WONJIP_CHOI_JP_Career_History_DX.docx
+++ b/public/resume/WONJIP_CHOI_JP_Career_History_DX.docx
@@ -89,7 +89,7 @@
           <w:color w:val="172033"/>
           <w:sz w:val="19"/>
         </w:rPr>
-        <w:t>造船・製造現場で培った業務理解に加え、TypeScript、Next.js、PostgreSQL、AIを用いた業務システム開発と品質検証を個人で継続しています。DocuMindでは、認証付き技術文書検索、出典付き回答、アクセス制御、監査ログ、55ファイル・339件の自動テストを実装しました。</w:t>
+        <w:t>造船・製造現場で培った業務理解に加え、TypeScript、Next.js、PostgreSQLを用いた業務システム開発と品質検証を個人で継続しています。DrawingFlowでは図面改訂、影響確認、独立承認、発行、製造確認、監査履歴を一連のワークフローとして実装し、DocuMindでは出典付き技術文書検索とアクセス制御を実装しました。</w:t>
       </w:r>
     </w:p>
     <w:p>
@@ -103,7 +103,7 @@
           <w:color w:val="172033"/>
           <w:sz w:val="19"/>
         </w:rPr>
-        <w:t>造船設計、製造DX、エンジニアリングシステム、CAD／PLM運用支援、技術オペレーション、業務自動化など、現場知識とデジタル実装を組み合わせられる職務を志望しています。日本でのワーキングホリデー経験があり、日本語での日常会話・基本的な業務コミュニケーションが可能です。就労ビザのサポートが必要ですが、日本での勤務・移住を前提に応募しています。</w:t>
+        <w:t>造船設計、製造DX、エンジニアリングシステム、CAD／PDM／PLM運用支援、技術オペレーション、業務自動化など、現場知識とデジタル実装を組み合わせられる職務を志望しています。日本でのワーキングホリデー経験があり、日本語での日常会話・基本的な業務コミュニケーションが可能です。就労ビザのサポートが必要ですが、日本での勤務・移住を前提に応募しています。</w:t>
       </w:r>
     </w:p>
     <w:p>
@@ -461,7 +461,7 @@
                 <w:color w:val="172033"/>
                 <w:sz w:val="18"/>
               </w:rPr>
-              <w:t>技術文書検索、出典トレーサビリティ、アクセス制御、監査ログ、検証可能な業務フロー</w:t>
+              <w:t>図面改訂・影響管理、承認・発行ゲート、技術文書検索、アクセス制御、追記専用監査ログ</w:t>
             </w:r>
           </w:p>
         </w:tc>
@@ -516,7 +516,7 @@
                 <w:color w:val="172033"/>
                 <w:sz w:val="18"/>
               </w:rPr>
-              <w:t>入力検証、回帰テスト、リリースゲート、課題再現、制約・改善項目の文書化</w:t>
+              <w:t>Vitest、Playwright、入力検証、回帰テスト、DB整合性確認、制約・改善項目の文書化</w:t>
             </w:r>
           </w:p>
         </w:tc>
@@ -597,6 +597,128 @@
           <w:sz w:val="25"/>
         </w:rPr>
         <w:t>■ 独立開発によるDX・業務システム実績</w:t>
+      </w:r>
+    </w:p>
+    <w:p>
+      <w:pPr>
+        <w:spacing w:before="120" w:after="40" w:line="240" w:lineRule="auto"/>
+      </w:pPr>
+      <w:r>
+        <w:rPr>
+          <w:rFonts w:ascii="Arial" w:hAnsi="Arial" w:eastAsia="Yu Gothic"/>
+          <w:b/>
+          <w:color w:val="172033"/>
+          <w:sz w:val="21"/>
+        </w:rPr>
+        <w:t>DrawingFlow｜図面改訂・影響管理ワークフロー</w:t>
+      </w:r>
+    </w:p>
+    <w:p>
+      <w:pPr>
+        <w:spacing w:before="0" w:after="40" w:line="276" w:lineRule="auto"/>
+      </w:pPr>
+      <w:r>
+        <w:rPr>
+          <w:rFonts w:ascii="Arial" w:hAnsi="Arial" w:eastAsia="Yu Gothic"/>
+          <w:b w:val="0"/>
+          <w:color w:val="526071"/>
+          <w:sz w:val="17"/>
+        </w:rPr>
+        <w:t>Next.js / TypeScript / PostgreSQL / Prisma / Auth.js / Zod / Vitest / Playwright</w:t>
+      </w:r>
+    </w:p>
+    <w:p>
+      <w:pPr>
+        <w:pStyle w:val="ListBullet"/>
+        <w:spacing w:after="40" w:line="269" w:lineRule="auto"/>
+        <w:ind w:left="340" w:hanging="170"/>
+      </w:pPr>
+      <w:r>
+        <w:rPr>
+          <w:rFonts w:ascii="Arial" w:hAnsi="Arial" w:eastAsia="Yu Gothic"/>
+          <w:b w:val="0"/>
+          <w:color w:val="172033"/>
+          <w:sz w:val="18"/>
+        </w:rPr>
+        <w:t>図面改訂をDraft、Review、Approved、Issued、Closedの状態で管理し、影響項目とリスクを審査前に可視化</w:t>
+      </w:r>
+    </w:p>
+    <w:p>
+      <w:pPr>
+        <w:pStyle w:val="ListBullet"/>
+        <w:spacing w:after="40" w:line="269" w:lineRule="auto"/>
+        <w:ind w:left="340" w:hanging="170"/>
+      </w:pPr>
+      <w:r>
+        <w:rPr>
+          <w:rFonts w:ascii="Arial" w:hAnsi="Arial" w:eastAsia="Yu Gothic"/>
+          <w:b w:val="0"/>
+          <w:color w:val="172033"/>
+          <w:sz w:val="18"/>
+        </w:rPr>
+        <w:t>起案者と承認者の分離、発効日、製造部門の受領確認をリリースゲートとして実装</w:t>
+      </w:r>
+    </w:p>
+    <w:p>
+      <w:pPr>
+        <w:pStyle w:val="ListBullet"/>
+        <w:spacing w:after="40" w:line="269" w:lineRule="auto"/>
+        <w:ind w:left="340" w:hanging="170"/>
+      </w:pPr>
+      <w:r>
+        <w:rPr>
+          <w:rFonts w:ascii="Arial" w:hAnsi="Arial" w:eastAsia="Yu Gothic"/>
+          <w:b w:val="0"/>
+          <w:color w:val="172033"/>
+          <w:sz w:val="18"/>
+        </w:rPr>
+        <w:t>プロジェクト単位の権限管理と、更新・削除をDB側で拒否する追記専用監査ログを実装</w:t>
+      </w:r>
+    </w:p>
+    <w:p>
+      <w:pPr>
+        <w:pStyle w:val="ListBullet"/>
+        <w:spacing w:after="40" w:line="269" w:lineRule="auto"/>
+        <w:ind w:left="340" w:hanging="170"/>
+      </w:pPr>
+      <w:r>
+        <w:rPr>
+          <w:rFonts w:ascii="Arial" w:hAnsi="Arial" w:eastAsia="Yu Gothic"/>
+          <w:b w:val="0"/>
+          <w:color w:val="172033"/>
+          <w:sz w:val="18"/>
+        </w:rPr>
+        <w:t>CSV図面台帳取込、型付きREST PDMアダプター境界、再試行可能なWebhook通知アウトボックスを実装</w:t>
+      </w:r>
+    </w:p>
+    <w:p>
+      <w:pPr>
+        <w:pStyle w:val="ListBullet"/>
+        <w:spacing w:after="40" w:line="269" w:lineRule="auto"/>
+        <w:ind w:left="340" w:hanging="170"/>
+      </w:pPr>
+      <w:r>
+        <w:rPr>
+          <w:rFonts w:ascii="Arial" w:hAnsi="Arial" w:eastAsia="Yu Gothic"/>
+          <w:b w:val="0"/>
+          <w:color w:val="172033"/>
+          <w:sz w:val="18"/>
+        </w:rPr>
+        <w:t>12件の単体・結合テスト、4件の複数ロールE2Eシナリオ、DB監査ログ不変性テストで検証</w:t>
+      </w:r>
+    </w:p>
+    <w:p>
+      <w:pPr>
+        <w:spacing w:before="0" w:after="80" w:line="276" w:lineRule="auto"/>
+      </w:pPr>
+      <w:r>
+        <w:rPr>
+          <w:rFonts w:ascii="Arial" w:hAnsi="Arial" w:eastAsia="Yu Gothic"/>
+          <w:b w:val="0"/>
+          <w:color w:val="526071"/>
+          <w:sz w:val="16"/>
+        </w:rPr>
+        <w:t>※ 合成データのみを使用した個人開発であり、勤務先への導入実績や実在するCAD／PDMとの接続を示すものではありません。</w:t>
       </w:r>
     </w:p>
     <w:p>
@@ -1010,7 +1132,7 @@
                 <w:color w:val="172033"/>
                 <w:sz w:val="18"/>
               </w:rPr>
-              <w:t>Vitest、入力検証、回帰テスト、アクセス制御、監査ログ</w:t>
+              <w:t>Vitest、Playwright、入力検証、回帰テスト、アクセス制御、監査ログ</w:t>
             </w:r>
           </w:p>
         </w:tc>
@@ -1065,7 +1187,7 @@
                 <w:color w:val="172033"/>
                 <w:sz w:val="18"/>
               </w:rPr>
-              <w:t>Git、Vercel、Google Cloud、技術文書・README・運用チェックリスト作成</w:t>
+              <w:t>Git、GitHub Actions、Vercel、Docker、技術文書・README・運用チェックリスト作成</w:t>
             </w:r>
           </w:p>
         </w:tc>

</xml_diff>